<commit_message>
docs: relatório e slides com screenshots do novo visual (sidebar)
Recaptura as figuras do app (Simulador, base de conhecimento, diagnóstico e
traço de inferência) no design atual e regenera o .docx (14 páginas) e o .pptx.

Co-Authored-By: Claude Opus 4.8 <noreply@anthropic.com>
</commit_message>
<xml_diff>
--- a/outputs/relatorio-ruledesk.docx
+++ b/outputs/relatorio-ruledesk.docx
@@ -3239,7 +3239,7 @@
       <w:r>
         <w:drawing>
           <wp:inline distT="0" distB="0" distL="0" distR="0">
-            <wp:extent cx="2857500" cy="5657850"/>
+            <wp:extent cx="2190750" cy="5029200"/>
             <wp:effectExtent t="0" r="0" b="0" l="0"/>
             <wp:docPr id="1" name="fig-form.png" descr="Figura 2 — Aba “Simulador”: cenários rápidos e formulário de entrada de fatos do chamado." title="Figura 2 — Aba “Simulador”: cenários rápidos e formulário de entrada de fatos do chamado."/>
             <wp:cNvGraphicFramePr>
@@ -3264,7 +3264,7 @@
                   <pic:spPr bwMode="auto">
                     <a:xfrm>
                       <a:off x="0" y="0"/>
-                      <a:ext cx="2857500" cy="5657850"/>
+                      <a:ext cx="2190750" cy="5029200"/>
                     </a:xfrm>
                     <a:prstGeom prst="rect">
                       <a:avLst/>
@@ -5765,7 +5765,7 @@
       <w:r>
         <w:drawing>
           <wp:inline distT="0" distB="0" distL="0" distR="0">
-            <wp:extent cx="5715000" cy="2657475"/>
+            <wp:extent cx="4953000" cy="2809875"/>
             <wp:effectExtent t="0" r="0" b="0" l="0"/>
             <wp:docPr id="1" name="fig-knowledge.png" descr="Figura 4 — Aba “Base de conhecimento”: as 16 regras com filtro por grupo e destaque das disparadas." title="Figura 4 — Aba “Base de conhecimento”: as 16 regras com filtro por grupo e destaque das disparadas."/>
             <wp:cNvGraphicFramePr>
@@ -5790,7 +5790,7 @@
                   <pic:spPr bwMode="auto">
                     <a:xfrm>
                       <a:off x="0" y="0"/>
-                      <a:ext cx="5715000" cy="2657475"/>
+                      <a:ext cx="4953000" cy="2809875"/>
                     </a:xfrm>
                     <a:prstGeom prst="rect">
                       <a:avLst/>
@@ -8142,7 +8142,7 @@
       <w:r>
         <w:drawing>
           <wp:inline distT="0" distB="0" distL="0" distR="0">
-            <wp:extent cx="5334000" cy="3019425"/>
+            <wp:extent cx="4762500" cy="3190875"/>
             <wp:effectExtent t="0" r="0" b="0" l="0"/>
             <wp:docPr id="1" name="fig-diagnosis.png" descr="Figura 6 — Painel de diagnóstico: prioridade, score, faixa P1–P4 e fatos coletados." title="Figura 6 — Painel de diagnóstico: prioridade, score, faixa P1–P4 e fatos coletados."/>
             <wp:cNvGraphicFramePr>
@@ -8167,7 +8167,7 @@
                   <pic:spPr bwMode="auto">
                     <a:xfrm>
                       <a:off x="0" y="0"/>
-                      <a:ext cx="5334000" cy="3019425"/>
+                      <a:ext cx="4762500" cy="3190875"/>
                     </a:xfrm>
                     <a:prstGeom prst="rect">
                       <a:avLst/>
@@ -8210,7 +8210,7 @@
       <w:r>
         <w:drawing>
           <wp:inline distT="0" distB="0" distL="0" distR="0">
-            <wp:extent cx="3810000" cy="4371975"/>
+            <wp:extent cx="2857500" cy="3981450"/>
             <wp:effectExtent t="0" r="0" b="0" l="0"/>
             <wp:docPr id="1" name="fig-trace.png" descr="Figura 7 — Motor de inferência passo a passo na interface: fatos, regras disparadas, cálculo do score em cascata e classificação (cenário da Tabela 6)." title="Figura 7 — Motor de inferência passo a passo na interface: fatos, regras disparadas, cálculo do score em cascata e classificação (cenário da Tabela 6)."/>
             <wp:cNvGraphicFramePr>
@@ -8235,7 +8235,7 @@
                   <pic:spPr bwMode="auto">
                     <a:xfrm>
                       <a:off x="0" y="0"/>
-                      <a:ext cx="3810000" cy="4371975"/>
+                      <a:ext cx="2857500" cy="3981450"/>
                     </a:xfrm>
                     <a:prstGeom prst="rect">
                       <a:avLst/>

</xml_diff>